<commit_message>
M1:Compleate task 5, add player model and normalize domain module names
</commit_message>
<xml_diff>
--- a/docs/M1_tasks.docx
+++ b/docs/M1_tasks.docx
@@ -369,7 +369,7 @@
         <w:rPr>
           <w:rFonts w:ascii="DejaVu Sans" w:hAnsi="DejaVu Sans"/>
         </w:rPr>
-        <w:t xml:space="preserve">☐ </w:t>
+        <w:t xml:space="preserve">☑ </w:t>
       </w:r>
       <w:r>
         <w:t>Create the smallest Player model needed for ownership and control.</w:t>
@@ -384,7 +384,7 @@
         <w:rPr>
           <w:rFonts w:ascii="DejaVu Sans" w:hAnsi="DejaVu Sans"/>
         </w:rPr>
-        <w:t xml:space="preserve">☐ </w:t>
+        <w:t xml:space="preserve">☑ </w:t>
       </w:r>
       <w:r>
         <w:t>Include a stable player identifier.</w:t>
@@ -399,7 +399,7 @@
         <w:rPr>
           <w:rFonts w:ascii="DejaVu Sans" w:hAnsi="DejaVu Sans"/>
         </w:rPr>
-        <w:t xml:space="preserve">☐ </w:t>
+        <w:t xml:space="preserve">☑ </w:t>
       </w:r>
       <w:r>
         <w:t>Include a display name.</w:t>
@@ -414,7 +414,7 @@
         <w:rPr>
           <w:rFonts w:ascii="DejaVu Sans" w:hAnsi="DejaVu Sans"/>
         </w:rPr>
-        <w:t xml:space="preserve">☐ </w:t>
+        <w:t xml:space="preserve">☑ </w:t>
       </w:r>
       <w:r>
         <w:t>Defer life totals and format-specific player state unless needed by the acceptance scenario.</w:t>

</xml_diff>

<commit_message>
M1: complete task 6 and update architecture docs for zone model
</commit_message>
<xml_diff>
--- a/docs/M1_tasks.docx
+++ b/docs/M1_tasks.docx
@@ -319,7 +319,19 @@
         <w:t xml:space="preserve">☑ </w:t>
       </w:r>
       <w:r>
-        <w:t>Track current zone.</w:t>
+        <w:t>Remove the independently stored mutable zone field from CardInstance; determine location from authoritative GameState zone membership.</w:t>
+      </w:r>
+    </w:p>
+    <w:p>
+      <w:pPr/>
+      <w:r>
+        <w:rPr>
+          <w:rFonts w:ascii="DejaVu Sans" w:hAnsi="DejaVu Sans"/>
+        </w:rPr>
+        <w:t xml:space="preserve">☑ </w:t>
+      </w:r>
+      <w:r>
+        <w:t>Update CardInstance tests so they no longer require or directly mutate a zone field.</w:t>
       </w:r>
     </w:p>
     <w:p>
@@ -519,18 +531,38 @@
       </w:r>
     </w:p>
     <w:p>
+      <w:pPr/>
+      <w:r>
+        <w:t>☑ Create a generic ZoneContainer that holds CardInstance object references rather than card copies or instance-ID-only entries.</w:t>
+      </w:r>
+    </w:p>
+    <w:p>
+      <w:pPr/>
+      <w:r>
+        <w:t>☑ Use ordered collections in ZoneContainer so library, graveyard, and later UI ordering can be preserved.</w:t>
+      </w:r>
+    </w:p>
+    <w:p>
+      <w:pPr/>
+      <w:r>
+        <w:t>☑ Keep Zone as the enum that identifies the kind of game-space zone.</w:t>
+      </w:r>
+    </w:p>
+    <w:p>
       <w:pPr>
         <w:spacing w:after="50"/>
         <w:ind w:left="173"/>
       </w:pPr>
       <w:r>
-        <w:rPr>
-          <w:rFonts w:ascii="DejaVu Sans" w:hAnsi="DejaVu Sans"/>
-        </w:rPr>
-        <w:t xml:space="preserve">☐ </w:t>
+        <w:t>☑ Define and document the ordering convention for ordered zones (including which end represents the top of a library or graveyard).</w:t>
       </w:r>
+    </w:p>
+    <w:p>
+      <w:pPr>
+        <w:pStyle w:val="Heading1"/>
+      </w:pPr>
       <w:r>
-        <w:t>Represent zones in a way that can preserve order where order matters.</w:t>
+        <w:t>Architecture decision: Zone remains an enum identifying zone type. ZoneContainer owns ordered CardInstance references, and GameState owns the containers. Zone membership—not a mutable CardInstance.zone field—is authoritative for location.</w:t>
       </w:r>
     </w:p>
     <w:p>
@@ -580,11 +612,9 @@
         <w:rPr>
           <w:rFonts w:ascii="DejaVu Sans" w:hAnsi="DejaVu Sans"/>
         </w:rPr>
-        <w:t xml:space="preserve">☐ </w:t>
+        <w:t>☐ Store card instances by object reference in zone containers; optionally maintain a separate instance-ID lookup only if it does not become a second location authority.</w:t>
       </w:r>
-      <w:r>
-        <w:t>Store all card instances participating in the game.</w:t>
-      </w:r>
+      <w:r/>
     </w:p>
     <w:p>
       <w:pPr>
@@ -595,10 +625,20 @@
         <w:rPr>
           <w:rFonts w:ascii="DejaVu Sans" w:hAnsi="DejaVu Sans"/>
         </w:rPr>
-        <w:t xml:space="preserve">☐ </w:t>
+        <w:t>☐ Make zone-container membership the single authoritative source of truth for card location.</w:t>
       </w:r>
+      <w:r/>
+    </w:p>
+    <w:p>
+      <w:pPr/>
       <w:r>
-        <w:t>Represent card location so there is one authoritative source of truth.</w:t>
+        <w:t>☐ Ensure a CardInstance can be located through GameState without storing duplicate mutable location state on the card.</w:t>
+      </w:r>
+    </w:p>
+    <w:p>
+      <w:pPr/>
+      <w:r>
+        <w:t>☐ Represent the game zones as a mapping such as dict[Zone, ZoneContainer] owned by GameState.</w:t>
       </w:r>
     </w:p>
     <w:p>
@@ -633,11 +673,9 @@
         <w:rPr>
           <w:rFonts w:ascii="DejaVu Sans" w:hAnsi="DejaVu Sans"/>
         </w:rPr>
-        <w:t xml:space="preserve">☐ </w:t>
+        <w:t>☐ Implement GameState-controlled movement of the same CardInstance object reference from one ZoneContainer to another.</w:t>
       </w:r>
-      <w:r>
-        <w:t>Implement a controlled operation to move one card instance from one zone to another.</w:t>
-      </w:r>
+      <w:r/>
     </w:p>
     <w:p>
       <w:pPr>
@@ -648,11 +686,9 @@
         <w:rPr>
           <w:rFonts w:ascii="DejaVu Sans" w:hAnsi="DejaVu Sans"/>
         </w:rPr>
-        <w:t xml:space="preserve">☐ </w:t>
+        <w:t>☐ Remove the CardInstance reference from the source ZoneContainer exactly once.</w:t>
       </w:r>
-      <w:r>
-        <w:t>Remove the card from the source zone exactly once.</w:t>
-      </w:r>
+      <w:r/>
     </w:p>
     <w:p>
       <w:pPr>
@@ -663,11 +699,9 @@
         <w:rPr>
           <w:rFonts w:ascii="DejaVu Sans" w:hAnsi="DejaVu Sans"/>
         </w:rPr>
-        <w:t xml:space="preserve">☐ </w:t>
+        <w:t>☐ Add the same CardInstance reference to the destination ZoneContainer exactly once using the destination ordering convention.</w:t>
       </w:r>
-      <w:r>
-        <w:t>Add the card to the destination zone exactly once.</w:t>
-      </w:r>
+      <w:r/>
     </w:p>
     <w:p>
       <w:pPr>
@@ -776,11 +810,9 @@
         <w:rPr>
           <w:rFonts w:ascii="DejaVu Sans" w:hAnsi="DejaVu Sans"/>
         </w:rPr>
-        <w:t xml:space="preserve">☐ </w:t>
+        <w:t>☐ Verify tapping does not alter card identity, ownership, controller, or authoritative zone membership.</w:t>
       </w:r>
-      <w:r>
-        <w:t>Verify tapping does not alter card identity, ownership, controller, or zone.</w:t>
-      </w:r>
+      <w:r/>
     </w:p>
     <w:p>
       <w:pPr>
@@ -821,6 +853,12 @@
       </w:r>
     </w:p>
     <w:p>
+      <w:pPr/>
+      <w:r>
+        <w:t>☐ Zone containers hold references to the same CardInstance objects; movement does not create replacement card objects.</w:t>
+      </w:r>
+    </w:p>
+    <w:p>
       <w:pPr>
         <w:spacing w:after="50"/>
         <w:ind w:left="173"/>
@@ -889,11 +927,9 @@
         <w:rPr>
           <w:rFonts w:ascii="DejaVu Sans" w:hAnsi="DejaVu Sans"/>
         </w:rPr>
-        <w:t xml:space="preserve">☐ </w:t>
+        <w:t>☐ Tapped state changes do not alter identity or authoritative zone membership.</w:t>
       </w:r>
-      <w:r>
-        <w:t>Tapped state changes do not alter identity or location.</w:t>
-      </w:r>
+      <w:r/>
     </w:p>
     <w:p>
       <w:pPr>
@@ -994,6 +1030,12 @@
       </w:r>
     </w:p>
     <w:p>
+      <w:pPr/>
+      <w:r>
+        <w:t>☐ Test that a moved card is the same CardInstance object before and after the move.</w:t>
+      </w:r>
+    </w:p>
+    <w:p>
       <w:pPr>
         <w:spacing w:after="50"/>
         <w:ind w:left="173"/>
@@ -1341,11 +1383,9 @@
         <w:rPr>
           <w:rFonts w:ascii="DejaVu Sans" w:hAnsi="DejaVu Sans"/>
         </w:rPr>
-        <w:t xml:space="preserve">☐ </w:t>
+        <w:t>☐ Review whether zone-container membership is the one authoritative representation of card location and CardInstance has no duplicate mutable location field.</w:t>
       </w:r>
-      <w:r>
-        <w:t>Review whether card location has one authoritative representation.</w:t>
-      </w:r>
+      <w:r/>
     </w:p>
     <w:p>
       <w:pPr>
@@ -1785,11 +1825,9 @@
         <w:rPr>
           <w:rFonts w:ascii="DejaVu Sans" w:hAnsi="DejaVu Sans"/>
         </w:rPr>
-        <w:t xml:space="preserve">☐ </w:t>
+        <w:t>☐ CardInstance object references can move between authoritative zone containers without duplication or loss.</w:t>
       </w:r>
-      <w:r>
-        <w:t>Card instances can move between zones without duplication or loss.</w:t>
-      </w:r>
+      <w:r/>
     </w:p>
     <w:p>
       <w:pPr>

</xml_diff>

<commit_message>
M1: further changes to architecture, CadrDefinition updated
</commit_message>
<xml_diff>
--- a/docs/M1_tasks.docx
+++ b/docs/M1_tasks.docx
@@ -283,13 +283,31 @@
         <w:ind w:left="173"/>
       </w:pPr>
       <w:r>
-        <w:rPr>
-          <w:rFonts w:ascii="DejaVu Sans" w:hAnsi="DejaVu Sans"/>
-        </w:rPr>
-        <w:t xml:space="preserve">☑ </w:t>
+        <w:t>☑ Replace the identifier-only CardDefinition link with a direct CardDefinition object reference on CardInstance.</w:t>
       </w:r>
+    </w:p>
+    <w:p>
+      <w:pPr/>
       <w:r>
-        <w:t>Reference its CardDefinition by identifier rather than duplicating catalog data.</w:t>
+        <w:t>☑ Do not add ordinary gameplay mutation APIs for CardDefinition during M1; defer controlled definition creation/mutation semantics to a later milestone if required by card effects or design/import tooling.</w:t>
+      </w:r>
+    </w:p>
+    <w:p>
+      <w:pPr/>
+      <w:r>
+        <w:t>☑ Verify multiple CardInstances can share one CardDefinition object while retaining independent instance identity and mutable game state.</w:t>
+      </w:r>
+    </w:p>
+    <w:p>
+      <w:pPr/>
+      <w:r>
+        <w:t>☑ Update CardInstance tests to construct a CardDefinition object and verify CardInstance retains the same object reference.</w:t>
+      </w:r>
+    </w:p>
+    <w:p>
+      <w:pPr/>
+      <w:r>
+        <w:t>☑ Preserve CardDefinition.definition_id as the stable catalog/serialization identity even though CardInstance holds the object reference directly.</w:t>
       </w:r>
     </w:p>
     <w:p>
@@ -579,13 +597,7 @@
         <w:ind w:left="173"/>
       </w:pPr>
       <w:r>
-        <w:rPr>
-          <w:rFonts w:ascii="DejaVu Sans" w:hAnsi="DejaVu Sans"/>
-        </w:rPr>
-        <w:t xml:space="preserve">☐ </w:t>
-      </w:r>
-      <w:r>
-        <w:t>Create a single in-memory game-state structure.</w:t>
+        <w:t>☐ Create a single in-memory GameState object representing the authoritative snapshot of one game; it is a state container, not an event loop.</w:t>
       </w:r>
     </w:p>
     <w:p>
@@ -594,13 +606,13 @@
         <w:ind w:left="173"/>
       </w:pPr>
       <w:r>
-        <w:rPr>
-          <w:rFonts w:ascii="DejaVu Sans" w:hAnsi="DejaVu Sans"/>
-        </w:rPr>
-        <w:t xml:space="preserve">☐ </w:t>
+        <w:t>☐ Store or reference participating players and use them to establish the zone containers required for the game.</w:t>
       </w:r>
+    </w:p>
+    <w:p>
+      <w:pPr/>
       <w:r>
-        <w:t>Store or reference participating players.</w:t>
+        <w:t>☐ Initialize the M1 zone layout from the supplied player set while keeping shared-zone handling explicit and minimal.</w:t>
       </w:r>
     </w:p>
     <w:p>
@@ -638,7 +650,7 @@
     <w:p>
       <w:pPr/>
       <w:r>
-        <w:t>☐ Represent the game zones as a mapping such as dict[Zone, ZoneContainer] owned by GameState.</w:t>
+        <w:t>☐ Have GameState own the zone containers using a structure that can distinguish player-scoped zones from shared zones; do not assume one dict[Zone, ZoneContainer] is sufficient for multiplayer.</w:t>
       </w:r>
     </w:p>
     <w:p>
@@ -955,6 +967,15 @@
       </w:r>
     </w:p>
     <w:p>
+      <w:pPr/>
+      <w:r>
+        <w:rPr>
+          <w:rFonts w:ascii="DejaVu Sans" w:hAnsi="DejaVu Sans"/>
+        </w:rPr>
+        <w:t>☐ Test that multiple CardInstances can reference the same CardDefinition object without copying or coupling their mutable instance state.</w:t>
+      </w:r>
+    </w:p>
+    <w:p>
       <w:pPr>
         <w:spacing w:after="50"/>
         <w:ind w:left="173"/>
@@ -1353,11 +1374,9 @@
         <w:rPr>
           <w:rFonts w:ascii="DejaVu Sans" w:hAnsi="DejaVu Sans"/>
         </w:rPr>
-        <w:t xml:space="preserve">☐ </w:t>
+        <w:t>☐ Review whether CardDefinition and CardInstance are genuinely separate concepts, with CardInstance directly referencing shared CardDefinition objects.</w:t>
       </w:r>
-      <w:r>
-        <w:t>Review whether CardDefinition and CardInstance are genuinely separate concepts.</w:t>
-      </w:r>
+      <w:r/>
     </w:p>
     <w:p>
       <w:pPr>
@@ -1780,11 +1799,9 @@
         <w:rPr>
           <w:rFonts w:ascii="DejaVu Sans" w:hAnsi="DejaVu Sans"/>
         </w:rPr>
-        <w:t xml:space="preserve">☐ </w:t>
+        <w:t>☐ Card definition and card instance are clearly separated, and CardInstance directly references its shared CardDefinition object.</w:t>
       </w:r>
-      <w:r>
-        <w:t>Card definition and card instance are clearly separated.</w:t>
-      </w:r>
+      <w:r/>
     </w:p>
     <w:p>
       <w:pPr>

</xml_diff>

<commit_message>
M!: step 8 added game_state object and added mechanics of moving inmemory representation of card from zone to zone.
</commit_message>
<xml_diff>
--- a/docs/M1_tasks.docx
+++ b/docs/M1_tasks.docx
@@ -597,7 +597,7 @@
         <w:ind w:left="173"/>
       </w:pPr>
       <w:r>
-        <w:t>☐ Create a single in-memory GameState object representing the authoritative snapshot of one game; it is a state container, not an event loop.</w:t>
+        <w:t>☑ Create a single in-memory GameState object representing the authoritative snapshot of one game; it is a state container, not an event loop.</w:t>
       </w:r>
     </w:p>
     <w:p>
@@ -606,13 +606,13 @@
         <w:ind w:left="173"/>
       </w:pPr>
       <w:r>
-        <w:t>☐ Store or reference participating players and use them to establish the zone containers required for the game.</w:t>
+        <w:t>☑ Store or reference participating players and use them to establish the zone containers required for the game.</w:t>
       </w:r>
     </w:p>
     <w:p>
       <w:pPr/>
       <w:r>
-        <w:t>☐ Initialize the M1 zone layout from the supplied player set while keeping shared-zone handling explicit and minimal.</w:t>
+        <w:t>☑ Initialize the M1 zone layout from the supplied player set while keeping shared-zone handling explicit and minimal.</w:t>
       </w:r>
     </w:p>
     <w:p>
@@ -621,12 +621,8 @@
         <w:ind w:left="173"/>
       </w:pPr>
       <w:r>
-        <w:rPr>
-          <w:rFonts w:ascii="DejaVu Sans" w:hAnsi="DejaVu Sans"/>
-        </w:rPr>
-        <w:t>☐ Store card instances by object reference in zone containers; optionally maintain a separate instance-ID lookup only if it does not become a second location authority.</w:t>
+        <w:t>☑ Store card instances by object reference in zone containers; optionally maintain a separate instance-ID lookup only if it does not become a second location authority.</w:t>
       </w:r>
-      <w:r/>
     </w:p>
     <w:p>
       <w:pPr>
@@ -634,23 +630,25 @@
         <w:ind w:left="173"/>
       </w:pPr>
       <w:r>
-        <w:rPr>
-          <w:rFonts w:ascii="DejaVu Sans" w:hAnsi="DejaVu Sans"/>
-        </w:rPr>
-        <w:t>☐ Make zone-container membership the single authoritative source of truth for card location.</w:t>
-      </w:r>
-      <w:r/>
-    </w:p>
-    <w:p>
-      <w:pPr/>
-      <w:r>
-        <w:t>☐ Ensure a CardInstance can be located through GameState without storing duplicate mutable location state on the card.</w:t>
+        <w:t>☑ Make zone-container membership the single authoritative source of truth for card location.</w:t>
       </w:r>
     </w:p>
     <w:p>
       <w:pPr/>
       <w:r>
-        <w:t>☐ Have GameState own the zone containers using a structure that can distinguish player-scoped zones from shared zones; do not assume one dict[Zone, ZoneContainer] is sufficient for multiplayer.</w:t>
+        <w:t>☑ Ensure a CardInstance can be located through GameState without storing duplicate mutable location state on the card.</w:t>
+      </w:r>
+    </w:p>
+    <w:p>
+      <w:pPr/>
+      <w:r>
+        <w:t>☑ Have GameState own the zone containers using the nested scope structure game_zones[scope][Zone], distinguishing player IDs from the shared scope.</w:t>
+      </w:r>
+    </w:p>
+    <w:p>
+      <w:pPr/>
+      <w:r>
+        <w:t>☑ Correct the game_zones field type/default to match the implemented nested structure (dict[str, dict[Zone, ZoneContainer]]) so Pydantic validates the model shape rather than accepting later unvalidated assignments.</w:t>
       </w:r>
     </w:p>
     <w:p>
@@ -662,7 +660,7 @@
         <w:rPr>
           <w:rFonts w:ascii="DejaVu Sans" w:hAnsi="DejaVu Sans"/>
         </w:rPr>
-        <w:t xml:space="preserve">☐ </w:t>
+        <w:t xml:space="preserve">☑ </w:t>
       </w:r>
       <w:r>
         <w:t>Ensure the structure can later support shuffle, draw, persistence, and multiplayer without requiring MTG-specific assumptions.</w:t>
@@ -685,7 +683,7 @@
         <w:rPr>
           <w:rFonts w:ascii="DejaVu Sans" w:hAnsi="DejaVu Sans"/>
         </w:rPr>
-        <w:t>☐ Implement GameState-controlled movement of the same CardInstance object reference from one ZoneContainer to another.</w:t>
+        <w:t>☑ Implement GameState-controlled movement of the same CardInstance object reference from one ZoneContainer to another.</w:t>
       </w:r>
       <w:r/>
     </w:p>
@@ -698,7 +696,7 @@
         <w:rPr>
           <w:rFonts w:ascii="DejaVu Sans" w:hAnsi="DejaVu Sans"/>
         </w:rPr>
-        <w:t>☐ Remove the CardInstance reference from the source ZoneContainer exactly once.</w:t>
+        <w:t>☑ Remove the CardInstance reference from the source ZoneContainer exactly once.</w:t>
       </w:r>
       <w:r/>
     </w:p>
@@ -711,7 +709,7 @@
         <w:rPr>
           <w:rFonts w:ascii="DejaVu Sans" w:hAnsi="DejaVu Sans"/>
         </w:rPr>
-        <w:t>☐ Add the same CardInstance reference to the destination ZoneContainer exactly once using the destination ordering convention.</w:t>
+        <w:t>☑ Add the same CardInstance reference to the destination ZoneContainer exactly once using the destination ordering convention.</w:t>
       </w:r>
       <w:r/>
     </w:p>
@@ -724,7 +722,7 @@
         <w:rPr>
           <w:rFonts w:ascii="DejaVu Sans" w:hAnsi="DejaVu Sans"/>
         </w:rPr>
-        <w:t xml:space="preserve">☐ </w:t>
+        <w:t xml:space="preserve">☑ </w:t>
       </w:r>
       <w:r>
         <w:t>Do not silently change ownership during a zone move.</w:t>
@@ -739,7 +737,7 @@
         <w:rPr>
           <w:rFonts w:ascii="DejaVu Sans" w:hAnsi="DejaVu Sans"/>
         </w:rPr>
-        <w:t xml:space="preserve">☐ </w:t>
+        <w:t xml:space="preserve">☑ </w:t>
       </w:r>
       <w:r>
         <w:t>Do not enforce MTG-specific move legality.</w:t>
@@ -754,7 +752,7 @@
         <w:rPr>
           <w:rFonts w:ascii="DejaVu Sans" w:hAnsi="DejaVu Sans"/>
         </w:rPr>
-        <w:t xml:space="preserve">☐ </w:t>
+        <w:t xml:space="preserve">☑ </w:t>
       </w:r>
       <w:r>
         <w:t>Return or raise a clear error for an unknown card instance or invalid source-state request.</w:t>

</xml_diff>

<commit_message>
M1 Step 10 tasks completed, refactored to better encapsulate move, placement and search functions between card, zonecontainer, and gamestate.
</commit_message>
<xml_diff>
--- a/docs/M1_tasks.docx
+++ b/docs/M1_tasks.docx
@@ -775,11 +775,9 @@
         <w:rPr>
           <w:rFonts w:ascii="DejaVu Sans" w:hAnsi="DejaVu Sans"/>
         </w:rPr>
-        <w:t xml:space="preserve">☐ </w:t>
+        <w:t>☑ Allow a card instance to be tapped.</w:t>
       </w:r>
-      <w:r>
-        <w:t>Allow a card instance to be tapped.</w:t>
-      </w:r>
+      <w:r/>
     </w:p>
     <w:p>
       <w:pPr>
@@ -790,11 +788,9 @@
         <w:rPr>
           <w:rFonts w:ascii="DejaVu Sans" w:hAnsi="DejaVu Sans"/>
         </w:rPr>
-        <w:t xml:space="preserve">☐ </w:t>
+        <w:t>☑ Allow a card instance to be untapped.</w:t>
       </w:r>
-      <w:r>
-        <w:t>Allow a card instance to be untapped.</w:t>
-      </w:r>
+      <w:r/>
     </w:p>
     <w:p>
       <w:pPr>
@@ -805,11 +801,9 @@
         <w:rPr>
           <w:rFonts w:ascii="DejaVu Sans" w:hAnsi="DejaVu Sans"/>
         </w:rPr>
-        <w:t xml:space="preserve">☐ </w:t>
+        <w:t>☑ Do not enforce MTG rules about which cards may legally tap.</w:t>
       </w:r>
-      <w:r>
-        <w:t>Do not enforce MTG rules about which cards may legally tap.</w:t>
-      </w:r>
+      <w:r/>
     </w:p>
     <w:p>
       <w:pPr>
@@ -817,12 +811,8 @@
         <w:ind w:left="173"/>
       </w:pPr>
       <w:r>
-        <w:rPr>
-          <w:rFonts w:ascii="DejaVu Sans" w:hAnsi="DejaVu Sans"/>
-        </w:rPr>
-        <w:t>☐ Verify tapping does not alter card identity, ownership, controller, or authoritative zone membership.</w:t>
+        <w:t>☑ Tapping does not alter card identity, ownership, controller, or authoritative zone membership. Note: these invariants are currently guaranteed by the architecture and method boundaries rather than by explicit gatekeeping or dedicated verification.</w:t>
       </w:r>
-      <w:r/>
     </w:p>
     <w:p>
       <w:pPr>
@@ -838,13 +828,7 @@
         <w:ind w:left="173"/>
       </w:pPr>
       <w:r>
-        <w:rPr>
-          <w:rFonts w:ascii="DejaVu Sans" w:hAnsi="DejaVu Sans"/>
-        </w:rPr>
-        <w:t xml:space="preserve">☐ </w:t>
-      </w:r>
-      <w:r>
-        <w:t>Every CardInstance has a unique identifier.</w:t>
+        <w:t>☑ Every CardInstance has a unique identifier. Normal creation through CardInstance.new() generates a UUID; direct construction may still supply an explicit ID for tests/restoration.</w:t>
       </w:r>
     </w:p>
     <w:p>
@@ -853,19 +837,13 @@
         <w:ind w:left="173"/>
       </w:pPr>
       <w:r>
-        <w:rPr>
-          <w:rFonts w:ascii="DejaVu Sans" w:hAnsi="DejaVu Sans"/>
-        </w:rPr>
-        <w:t xml:space="preserve">☐ </w:t>
-      </w:r>
-      <w:r>
-        <w:t>Every card instance exists in exactly one zone at a time.</w:t>
+        <w:t>☑ Once placed in GameState, every card instance exists in exactly one authoritative zone at a time; place_card() rejects an instance already present in a zone.</w:t>
       </w:r>
     </w:p>
     <w:p>
       <w:pPr/>
       <w:r>
-        <w:t>☐ Zone containers hold references to the same CardInstance objects; movement does not create replacement card objects.</w:t>
+        <w:t>☑ Zone containers hold references to the same CardInstance objects; movement does not create replacement card objects.</w:t>
       </w:r>
     </w:p>
     <w:p>
@@ -874,13 +852,7 @@
         <w:ind w:left="173"/>
       </w:pPr>
       <w:r>
-        <w:rPr>
-          <w:rFonts w:ascii="DejaVu Sans" w:hAnsi="DejaVu Sans"/>
-        </w:rPr>
-        <w:t xml:space="preserve">☐ </w:t>
-      </w:r>
-      <w:r>
-        <w:t>Moving a card does not duplicate it.</w:t>
+        <w:t>☑ Moving a card does not duplicate it.</w:t>
       </w:r>
     </w:p>
     <w:p>
@@ -889,13 +861,7 @@
         <w:ind w:left="173"/>
       </w:pPr>
       <w:r>
-        <w:rPr>
-          <w:rFonts w:ascii="DejaVu Sans" w:hAnsi="DejaVu Sans"/>
-        </w:rPr>
-        <w:t xml:space="preserve">☐ </w:t>
-      </w:r>
-      <w:r>
-        <w:t>Moving a card does not lose it.</w:t>
+        <w:t>☑ Moving a card does not lose it.</w:t>
       </w:r>
     </w:p>
     <w:p>
@@ -904,13 +870,7 @@
         <w:ind w:left="173"/>
       </w:pPr>
       <w:r>
-        <w:rPr>
-          <w:rFonts w:ascii="DejaVu Sans" w:hAnsi="DejaVu Sans"/>
-        </w:rPr>
-        <w:t xml:space="preserve">☐ </w:t>
-      </w:r>
-      <w:r>
-        <w:t>Ownership remains stable across zone changes.</w:t>
+        <w:t>☑ Ownership remains stable across zone changes.</w:t>
       </w:r>
     </w:p>
     <w:p>
@@ -919,13 +879,7 @@
         <w:ind w:left="173"/>
       </w:pPr>
       <w:r>
-        <w:rPr>
-          <w:rFonts w:ascii="DejaVu Sans" w:hAnsi="DejaVu Sans"/>
-        </w:rPr>
-        <w:t xml:space="preserve">☐ </w:t>
-      </w:r>
-      <w:r>
-        <w:t>Controller is modeled separately from owner.</w:t>
+        <w:t>☑ Controller is modeled separately from owner.</w:t>
       </w:r>
     </w:p>
     <w:p>
@@ -934,12 +888,14 @@
         <w:ind w:left="173"/>
       </w:pPr>
       <w:r>
-        <w:rPr>
-          <w:rFonts w:ascii="DejaVu Sans" w:hAnsi="DejaVu Sans"/>
-        </w:rPr>
-        <w:t>☐ Tapped state changes do not alter identity or authoritative zone membership.</w:t>
+        <w:t>☑ Tapped state changes do not alter identity or authoritative zone membership. This is currently guaranteed by architecture/method boundaries rather than dedicated gatekeeping assertions.</w:t>
       </w:r>
-      <w:r/>
+    </w:p>
+    <w:p>
+      <w:pPr/>
+      <w:r>
+        <w:t>Note: ZoneContainer now owns card collection operations (add/remove/contains), keeping GameState independent of the underlying list mechanics.</w:t>
+      </w:r>
     </w:p>
     <w:p>
       <w:pPr>
@@ -1093,11 +1049,9 @@
         <w:rPr>
           <w:rFonts w:ascii="DejaVu Sans" w:hAnsi="DejaVu Sans"/>
         </w:rPr>
-        <w:t xml:space="preserve">☐ </w:t>
+        <w:t>☑ Test tap and untap transitions.</w:t>
       </w:r>
-      <w:r>
-        <w:t>Test tap and untap transitions.</w:t>
-      </w:r>
+      <w:r/>
     </w:p>
     <w:p>
       <w:pPr>

</xml_diff>

<commit_message>
M1 Step 11 tasks completed, additional tests, invariants identified/tested
</commit_message>
<xml_diff>
--- a/docs/M1_tasks.docx
+++ b/docs/M1_tasks.docx
@@ -914,11 +914,9 @@
         <w:rPr>
           <w:rFonts w:ascii="DejaVu Sans" w:hAnsi="DejaVu Sans"/>
         </w:rPr>
-        <w:t xml:space="preserve">☐ </w:t>
+        <w:t>☑ Test that repeated CardInstance.new() creation produces distinct instance IDs across a representative 1,000-instance sample (sanity/regression check, not a proof of global UUID uniqueness).</w:t>
       </w:r>
-      <w:r>
-        <w:t>Test that multiple instances created from one definition have unique instance IDs.</w:t>
-      </w:r>
+      <w:r/>
     </w:p>
     <w:p>
       <w:pPr/>
@@ -926,7 +924,7 @@
         <w:rPr>
           <w:rFonts w:ascii="DejaVu Sans" w:hAnsi="DejaVu Sans"/>
         </w:rPr>
-        <w:t>☐ Test that multiple CardInstances can reference the same CardDefinition object without copying or coupling their mutable instance state.</w:t>
+        <w:t>☑ Test that multiple CardInstances can reference the same CardDefinition object without copying or coupling their mutable instance state.</w:t>
       </w:r>
     </w:p>
     <w:p>
@@ -938,7 +936,7 @@
         <w:rPr>
           <w:rFonts w:ascii="DejaVu Sans" w:hAnsi="DejaVu Sans"/>
         </w:rPr>
-        <w:t xml:space="preserve">☐ </w:t>
+        <w:t xml:space="preserve">☑ </w:t>
       </w:r>
       <w:r>
         <w:t>Test moving a card from library to hand.</w:t>
@@ -953,7 +951,7 @@
         <w:rPr>
           <w:rFonts w:ascii="DejaVu Sans" w:hAnsi="DejaVu Sans"/>
         </w:rPr>
-        <w:t xml:space="preserve">☐ </w:t>
+        <w:t xml:space="preserve">☑ </w:t>
       </w:r>
       <w:r>
         <w:t>Test moving a card from library to battlefield.</w:t>
@@ -968,7 +966,7 @@
         <w:rPr>
           <w:rFonts w:ascii="DejaVu Sans" w:hAnsi="DejaVu Sans"/>
         </w:rPr>
-        <w:t xml:space="preserve">☐ </w:t>
+        <w:t xml:space="preserve">☑ </w:t>
       </w:r>
       <w:r>
         <w:t>Test moving a card between other modeled zones as appropriate.</w:t>
@@ -983,7 +981,7 @@
         <w:rPr>
           <w:rFonts w:ascii="DejaVu Sans" w:hAnsi="DejaVu Sans"/>
         </w:rPr>
-        <w:t xml:space="preserve">☐ </w:t>
+        <w:t xml:space="preserve">☑ </w:t>
       </w:r>
       <w:r>
         <w:t>Test that a move preserves total card-instance count.</w:t>
@@ -998,16 +996,14 @@
         <w:rPr>
           <w:rFonts w:ascii="DejaVu Sans" w:hAnsi="DejaVu Sans"/>
         </w:rPr>
-        <w:t xml:space="preserve">☐ </w:t>
+        <w:t>☑ Test that normal GameState placement/movement preserves single-zone membership; duplicate placement is rejected and the card remains in its original zone.</w:t>
       </w:r>
-      <w:r>
-        <w:t>Test that no instance appears in more than one zone.</w:t>
-      </w:r>
+      <w:r/>
     </w:p>
     <w:p>
       <w:pPr/>
       <w:r>
-        <w:t>☐ Test that a moved card is the same CardInstance object before and after the move.</w:t>
+        <w:t>☑ Test that a moved card is the same CardInstance object before and after the move.</w:t>
       </w:r>
     </w:p>
     <w:p>
@@ -1019,11 +1015,9 @@
         <w:rPr>
           <w:rFonts w:ascii="DejaVu Sans" w:hAnsi="DejaVu Sans"/>
         </w:rPr>
-        <w:t xml:space="preserve">☐ </w:t>
+        <w:t>☑ Test that ownership remains unchanged after movement.</w:t>
       </w:r>
-      <w:r>
-        <w:t>Test that ownership remains unchanged after movement.</w:t>
-      </w:r>
+      <w:r/>
     </w:p>
     <w:p>
       <w:pPr>
@@ -1034,11 +1028,9 @@
         <w:rPr>
           <w:rFonts w:ascii="DejaVu Sans" w:hAnsi="DejaVu Sans"/>
         </w:rPr>
-        <w:t xml:space="preserve">☐ </w:t>
+        <w:t>☑ Controller/owner separation is modeled, but controller-changing behavior is deferred; no GameState controller mutation exists yet, so no controller-change behavior test is required in M1.</w:t>
       </w:r>
-      <w:r>
-        <w:t>Test that controller can differ from owner without changing ownership.</w:t>
-      </w:r>
+      <w:r/>
     </w:p>
     <w:p>
       <w:pPr>
@@ -1062,7 +1054,7 @@
         <w:rPr>
           <w:rFonts w:ascii="DejaVu Sans" w:hAnsi="DejaVu Sans"/>
         </w:rPr>
-        <w:t xml:space="preserve">☐ </w:t>
+        <w:t xml:space="preserve">☑ </w:t>
       </w:r>
       <w:r>
         <w:t>Use fictional test cards rather than live MTG catalog data.</w:t>

</xml_diff>

<commit_message>
M1: complete acceptance, regression, architecture review, and documentation
</commit_message>
<xml_diff>
--- a/docs/M1_tasks.docx
+++ b/docs/M1_tasks.docx
@@ -1077,11 +1077,9 @@
         <w:rPr>
           <w:rFonts w:ascii="DejaVu Sans" w:hAnsi="DejaVu Sans"/>
         </w:rPr>
-        <w:t xml:space="preserve">☐ </w:t>
+        <w:t>☑ Create one or more fictional CardDefinitions sufficient for the M1 acceptance scenario.</w:t>
       </w:r>
-      <w:r>
-        <w:t>Create two fictional CardDefinitions.</w:t>
-      </w:r>
+      <w:r/>
     </w:p>
     <w:p>
       <w:pPr>
@@ -1092,11 +1090,9 @@
         <w:rPr>
           <w:rFonts w:ascii="DejaVu Sans" w:hAnsi="DejaVu Sans"/>
         </w:rPr>
-        <w:t xml:space="preserve">☐ </w:t>
+        <w:t>☑ Create several distinct CardInstances from those definitions.</w:t>
       </w:r>
-      <w:r>
-        <w:t>Create several distinct CardInstances from those definitions.</w:t>
-      </w:r>
+      <w:r/>
     </w:p>
     <w:p>
       <w:pPr>
@@ -1107,11 +1103,9 @@
         <w:rPr>
           <w:rFonts w:ascii="DejaVu Sans" w:hAnsi="DejaVu Sans"/>
         </w:rPr>
-        <w:t xml:space="preserve">☐ </w:t>
+        <w:t>☑ Create one Player.</w:t>
       </w:r>
-      <w:r>
-        <w:t>Create one Player.</w:t>
-      </w:r>
+      <w:r/>
     </w:p>
     <w:p>
       <w:pPr>
@@ -1122,11 +1116,9 @@
         <w:rPr>
           <w:rFonts w:ascii="DejaVu Sans" w:hAnsi="DejaVu Sans"/>
         </w:rPr>
-        <w:t xml:space="preserve">☐ </w:t>
+        <w:t>☑ Place the instances into that player's library.</w:t>
       </w:r>
-      <w:r>
-        <w:t>Place the instances into that player's library.</w:t>
-      </w:r>
+      <w:r/>
     </w:p>
     <w:p>
       <w:pPr>
@@ -1137,11 +1129,9 @@
         <w:rPr>
           <w:rFonts w:ascii="DejaVu Sans" w:hAnsi="DejaVu Sans"/>
         </w:rPr>
-        <w:t xml:space="preserve">☐ </w:t>
+        <w:t>☑ Verify every instance has a unique identity.</w:t>
       </w:r>
-      <w:r>
-        <w:t>Verify every instance has a unique identity.</w:t>
-      </w:r>
+      <w:r/>
     </w:p>
     <w:p>
       <w:pPr>
@@ -1152,11 +1142,9 @@
         <w:rPr>
           <w:rFonts w:ascii="DejaVu Sans" w:hAnsi="DejaVu Sans"/>
         </w:rPr>
-        <w:t xml:space="preserve">☐ </w:t>
+        <w:t>☑ Move one instance from library to hand.</w:t>
       </w:r>
-      <w:r>
-        <w:t>Move one instance from library to hand.</w:t>
-      </w:r>
+      <w:r/>
     </w:p>
     <w:p>
       <w:pPr>
@@ -1167,11 +1155,9 @@
         <w:rPr>
           <w:rFonts w:ascii="DejaVu Sans" w:hAnsi="DejaVu Sans"/>
         </w:rPr>
-        <w:t xml:space="preserve">☐ </w:t>
+        <w:t>☑ Move another instance from library to battlefield.</w:t>
       </w:r>
-      <w:r>
-        <w:t>Move another instance from library to battlefield.</w:t>
-      </w:r>
+      <w:r/>
     </w:p>
     <w:p>
       <w:pPr>
@@ -1182,11 +1168,9 @@
         <w:rPr>
           <w:rFonts w:ascii="DejaVu Sans" w:hAnsi="DejaVu Sans"/>
         </w:rPr>
-        <w:t xml:space="preserve">☐ </w:t>
+        <w:t>☑ Tap the battlefield instance.</w:t>
       </w:r>
-      <w:r>
-        <w:t>Tap the battlefield instance.</w:t>
-      </w:r>
+      <w:r/>
     </w:p>
     <w:p>
       <w:pPr>
@@ -1197,11 +1181,9 @@
         <w:rPr>
           <w:rFonts w:ascii="DejaVu Sans" w:hAnsi="DejaVu Sans"/>
         </w:rPr>
-        <w:t xml:space="preserve">☐ </w:t>
+        <w:t>☑ Verify no card was duplicated or lost.</w:t>
       </w:r>
-      <w:r>
-        <w:t>Verify no card was duplicated or lost.</w:t>
-      </w:r>
+      <w:r/>
     </w:p>
     <w:p>
       <w:pPr>
@@ -1212,10 +1194,14 @@
         <w:rPr>
           <w:rFonts w:ascii="DejaVu Sans" w:hAnsi="DejaVu Sans"/>
         </w:rPr>
-        <w:t xml:space="preserve">☐ </w:t>
+        <w:t>☑ Verify ownership remains unchanged throughout.</w:t>
       </w:r>
+      <w:r/>
+    </w:p>
+    <w:p>
+      <w:pPr/>
       <w:r>
-        <w:t>Verify ownership remains unchanged throughout.</w:t>
+        <w:t>Future API note: M1 acceptance exposed a likely need for GameState query helpers such as get_card(instance_id). Richer queries by owner, controller, zone, type, or subtype should be added only when later API/gameplay requirements justify them; zone membership remains authoritative.</w:t>
       </w:r>
     </w:p>
     <w:p>
@@ -1232,13 +1218,7 @@
         <w:ind w:left="173"/>
       </w:pPr>
       <w:r>
-        <w:rPr>
-          <w:rFonts w:ascii="DejaVu Sans" w:hAnsi="DejaVu Sans"/>
-        </w:rPr>
-        <w:t xml:space="preserve">☐ </w:t>
-      </w:r>
-      <w:r>
-        <w:t>Run the existing backend health test.</w:t>
+        <w:t>☑ Run the existing backend health test.</w:t>
       </w:r>
     </w:p>
     <w:p>
@@ -1247,13 +1227,7 @@
         <w:ind w:left="173"/>
       </w:pPr>
       <w:r>
-        <w:rPr>
-          <w:rFonts w:ascii="DejaVu Sans" w:hAnsi="DejaVu Sans"/>
-        </w:rPr>
-        <w:t xml:space="preserve">☐ </w:t>
-      </w:r>
-      <w:r>
-        <w:t>Run the complete backend pytest suite.</w:t>
+        <w:t>☑ Run the complete backend pytest suite.</w:t>
       </w:r>
     </w:p>
     <w:p>
@@ -1262,13 +1236,7 @@
         <w:ind w:left="173"/>
       </w:pPr>
       <w:r>
-        <w:rPr>
-          <w:rFonts w:ascii="DejaVu Sans" w:hAnsi="DejaVu Sans"/>
-        </w:rPr>
-        <w:t xml:space="preserve">☐ </w:t>
-      </w:r>
-      <w:r>
-        <w:t>Confirm FastAPI still starts successfully.</w:t>
+        <w:t>☑ Confirm FastAPI still starts successfully.</w:t>
       </w:r>
     </w:p>
     <w:p>
@@ -1277,13 +1245,7 @@
         <w:ind w:left="173"/>
       </w:pPr>
       <w:r>
-        <w:rPr>
-          <w:rFonts w:ascii="DejaVu Sans" w:hAnsi="DejaVu Sans"/>
-        </w:rPr>
-        <w:t xml:space="preserve">☐ </w:t>
-      </w:r>
-      <w:r>
-        <w:t>Confirm GET /api/health still returns the expected response.</w:t>
+        <w:t>☑ Confirm GET /api/health still returns the expected response.</w:t>
       </w:r>
     </w:p>
     <w:p>
@@ -1292,13 +1254,7 @@
         <w:ind w:left="173"/>
       </w:pPr>
       <w:r>
-        <w:rPr>
-          <w:rFonts w:ascii="DejaVu Sans" w:hAnsi="DejaVu Sans"/>
-        </w:rPr>
-        <w:t xml:space="preserve">☐ </w:t>
-      </w:r>
-      <w:r>
-        <w:t>Confirm no M1 change requires unnecessary frontend changes.</w:t>
+        <w:t>☑ Confirm no M1 change requires unnecessary frontend changes.</w:t>
       </w:r>
     </w:p>
     <w:p>
@@ -1829,11 +1785,9 @@
         <w:rPr>
           <w:rFonts w:ascii="DejaVu Sans" w:hAnsi="DejaVu Sans"/>
         </w:rPr>
-        <w:t xml:space="preserve">☐ </w:t>
+        <w:t>☑ The M1 acceptance scenario passes.</w:t>
       </w:r>
-      <w:r>
-        <w:t>The M1 acceptance scenario passes.</w:t>
-      </w:r>
+      <w:r/>
     </w:p>
     <w:p>
       <w:pPr>

</xml_diff>

<commit_message>
docs: close M1 and update M2 planning
</commit_message>
<xml_diff>
--- a/docs/M1_tasks.docx
+++ b/docs/M1_tasks.docx
@@ -1274,7 +1274,7 @@
         <w:rPr>
           <w:rFonts w:ascii="DejaVu Sans" w:hAnsi="DejaVu Sans"/>
         </w:rPr>
-        <w:t>☐ Review whether CardDefinition and CardInstance are genuinely separate concepts, with CardInstance directly referencing shared CardDefinition objects.</w:t>
+        <w:t>☑ Review whether CardDefinition and CardInstance are genuinely separate concepts, with CardInstance directly referencing shared CardDefinition objects.</w:t>
       </w:r>
       <w:r/>
     </w:p>
@@ -1287,11 +1287,9 @@
         <w:rPr>
           <w:rFonts w:ascii="DejaVu Sans" w:hAnsi="DejaVu Sans"/>
         </w:rPr>
-        <w:t xml:space="preserve">☐ </w:t>
+        <w:t>☑ Review whether ownership and control are genuinely separate concepts.</w:t>
       </w:r>
-      <w:r>
-        <w:t>Review whether ownership and control are genuinely separate concepts.</w:t>
-      </w:r>
+      <w:r/>
     </w:p>
     <w:p>
       <w:pPr>
@@ -1302,7 +1300,7 @@
         <w:rPr>
           <w:rFonts w:ascii="DejaVu Sans" w:hAnsi="DejaVu Sans"/>
         </w:rPr>
-        <w:t>☐ Review whether zone-container membership is the one authoritative representation of card location and CardInstance has no duplicate mutable location field.</w:t>
+        <w:t>☑ Review whether zone-container membership is the one authoritative representation of card location and CardInstance has no duplicate mutable location field.</w:t>
       </w:r>
       <w:r/>
     </w:p>
@@ -1315,11 +1313,9 @@
         <w:rPr>
           <w:rFonts w:ascii="DejaVu Sans" w:hAnsi="DejaVu Sans"/>
         </w:rPr>
-        <w:t xml:space="preserve">☐ </w:t>
+        <w:t>☑ Review catalog neutrality: the core definition/instance/state model is catalog-neutral and rules-light; the current Zone vocabulary is MTG-first and may later become game-specific or configurable.</w:t>
       </w:r>
-      <w:r>
-        <w:t>Review whether the model remains catalog-neutral.</w:t>
-      </w:r>
+      <w:r/>
     </w:p>
     <w:p>
       <w:pPr>
@@ -1330,11 +1326,9 @@
         <w:rPr>
           <w:rFonts w:ascii="DejaVu Sans" w:hAnsi="DejaVu Sans"/>
         </w:rPr>
-        <w:t xml:space="preserve">☐ </w:t>
+        <w:t>☑ Review whether persistence can be added later without redesigning the domain; Pydantic serialization and stable IDs provide a clean mapping to future storage/reconstruction.</w:t>
       </w:r>
-      <w:r>
-        <w:t>Review whether persistence can be added later without redesigning the domain.</w:t>
-      </w:r>
+      <w:r/>
     </w:p>
     <w:p>
       <w:pPr>
@@ -1345,11 +1339,9 @@
         <w:rPr>
           <w:rFonts w:ascii="DejaVu Sans" w:hAnsi="DejaVu Sans"/>
         </w:rPr>
-        <w:t xml:space="preserve">☐ </w:t>
+        <w:t>☑ Review whether multiplayer can later reuse the same domain model; GameState already supports multiple players, while network/session registration and a future SessionRegistry remain above the domain layer.</w:t>
       </w:r>
-      <w:r>
-        <w:t>Review whether multiplayer can later reuse the same domain model.</w:t>
-      </w:r>
+      <w:r/>
     </w:p>
     <w:p>
       <w:pPr>
@@ -1360,11 +1352,9 @@
         <w:rPr>
           <w:rFonts w:ascii="DejaVu Sans" w:hAnsi="DejaVu Sans"/>
         </w:rPr>
-        <w:t xml:space="preserve">☐ </w:t>
+        <w:t>☑ Remove unnecessary abstractions or premature future features before closing M1.</w:t>
       </w:r>
-      <w:r>
-        <w:t>Remove unnecessary abstractions or premature future features before closing M1.</w:t>
-      </w:r>
+      <w:r/>
     </w:p>
     <w:p>
       <w:pPr>
@@ -1383,11 +1373,9 @@
         <w:rPr>
           <w:rFonts w:ascii="DejaVu Sans" w:hAnsi="DejaVu Sans"/>
         </w:rPr>
-        <w:t xml:space="preserve">☐ </w:t>
+        <w:t>☑ Document durable architecture decisions made during M1, including definition/instance separation, authoritative zone membership, player/shared scopes, creation/placement/movement boundaries, and future session/query direction.</w:t>
       </w:r>
-      <w:r>
-        <w:t>Document any durable architecture decisions made during M1.</w:t>
-      </w:r>
+      <w:r/>
     </w:p>
     <w:p>
       <w:pPr>
@@ -1398,11 +1386,9 @@
         <w:rPr>
           <w:rFonts w:ascii="DejaVu Sans" w:hAnsi="DejaVu Sans"/>
         </w:rPr>
-        <w:t xml:space="preserve">☐ </w:t>
+        <w:t>☑ Update README and project architecture documentation where behavior or structure changed.</w:t>
       </w:r>
-      <w:r>
-        <w:t>Update README or architecture documentation only where behavior or structure changed.</w:t>
-      </w:r>
+      <w:r/>
     </w:p>
     <w:p>
       <w:pPr>
@@ -1601,11 +1587,9 @@
         <w:rPr>
           <w:rFonts w:ascii="DejaVu Sans" w:hAnsi="DejaVu Sans"/>
         </w:rPr>
-        <w:t xml:space="preserve">☐ </w:t>
+        <w:t>☐ Deferred: Networked/session multiplayer (the M1 domain model already supports multiple players within one GameState).</w:t>
       </w:r>
-      <w:r>
-        <w:t>Deferred: Multiplayer</w:t>
-      </w:r>
+      <w:r/>
     </w:p>
     <w:p>
       <w:pPr>
@@ -1684,11 +1668,9 @@
         <w:rPr>
           <w:rFonts w:ascii="DejaVu Sans" w:hAnsi="DejaVu Sans"/>
         </w:rPr>
-        <w:t xml:space="preserve">☐ </w:t>
+        <w:t>☑ Core CardDefinition, CardInstance, Player, Zone, and GameState concepts exist.</w:t>
       </w:r>
-      <w:r>
-        <w:t>Core CardDefinition, CardInstance, Player, Zone, and GameState concepts exist.</w:t>
-      </w:r>
+      <w:r/>
     </w:p>
     <w:p>
       <w:pPr>
@@ -1699,7 +1681,7 @@
         <w:rPr>
           <w:rFonts w:ascii="DejaVu Sans" w:hAnsi="DejaVu Sans"/>
         </w:rPr>
-        <w:t>☐ Card definition and card instance are clearly separated, and CardInstance directly references its shared CardDefinition object.</w:t>
+        <w:t>☑ Card definition and card instance are clearly separated, and CardInstance directly references its shared CardDefinition object.</w:t>
       </w:r>
       <w:r/>
     </w:p>
@@ -1712,11 +1694,9 @@
         <w:rPr>
           <w:rFonts w:ascii="DejaVu Sans" w:hAnsi="DejaVu Sans"/>
         </w:rPr>
-        <w:t xml:space="preserve">☐ </w:t>
+        <w:t>☑ Owner and controller are distinct.</w:t>
       </w:r>
-      <w:r>
-        <w:t>Owner and controller are distinct.</w:t>
-      </w:r>
+      <w:r/>
     </w:p>
     <w:p>
       <w:pPr>
@@ -1727,11 +1707,9 @@
         <w:rPr>
           <w:rFonts w:ascii="DejaVu Sans" w:hAnsi="DejaVu Sans"/>
         </w:rPr>
-        <w:t xml:space="preserve">☐ </w:t>
+        <w:t>☑ A game state can hold multiple unique card instances.</w:t>
       </w:r>
-      <w:r>
-        <w:t>A game state can hold multiple unique card instances.</w:t>
-      </w:r>
+      <w:r/>
     </w:p>
     <w:p>
       <w:pPr>
@@ -1742,7 +1720,7 @@
         <w:rPr>
           <w:rFonts w:ascii="DejaVu Sans" w:hAnsi="DejaVu Sans"/>
         </w:rPr>
-        <w:t>☐ CardInstance object references can move between authoritative zone containers without duplication or loss.</w:t>
+        <w:t>☑ CardInstance object references can move between authoritative zone containers without duplication or loss.</w:t>
       </w:r>
       <w:r/>
     </w:p>
@@ -1755,11 +1733,9 @@
         <w:rPr>
           <w:rFonts w:ascii="DejaVu Sans" w:hAnsi="DejaVu Sans"/>
         </w:rPr>
-        <w:t xml:space="preserve">☐ </w:t>
+        <w:t>☑ Tapped state can change independently of location and identity.</w:t>
       </w:r>
-      <w:r>
-        <w:t>Tapped state can change independently of location and identity.</w:t>
-      </w:r>
+      <w:r/>
     </w:p>
     <w:p>
       <w:pPr>
@@ -1770,11 +1746,9 @@
         <w:rPr>
           <w:rFonts w:ascii="DejaVu Sans" w:hAnsi="DejaVu Sans"/>
         </w:rPr>
-        <w:t xml:space="preserve">☐ </w:t>
+        <w:t>☑ Domain invariants are covered by automated tests.</w:t>
       </w:r>
-      <w:r>
-        <w:t>Domain invariants are covered by automated tests.</w:t>
-      </w:r>
+      <w:r/>
     </w:p>
     <w:p>
       <w:pPr>
@@ -1798,11 +1772,9 @@
         <w:rPr>
           <w:rFonts w:ascii="DejaVu Sans" w:hAnsi="DejaVu Sans"/>
         </w:rPr>
-        <w:t xml:space="preserve">☐ </w:t>
+        <w:t>☑ Existing M0 backend tests still pass.</w:t>
       </w:r>
-      <w:r>
-        <w:t>Existing M0 backend tests still pass.</w:t>
-      </w:r>
+      <w:r/>
     </w:p>
     <w:p>
       <w:pPr>
@@ -1813,11 +1785,9 @@
         <w:rPr>
           <w:rFonts w:ascii="DejaVu Sans" w:hAnsi="DejaVu Sans"/>
         </w:rPr>
-        <w:t xml:space="preserve">☐ </w:t>
+        <w:t>☑ No external catalog, persistence, WebSocket, networked/session multiplayer, or frontend card-UI dependency was introduced.</w:t>
       </w:r>
-      <w:r>
-        <w:t>No external catalog, persistence, WebSocket, multiplayer, or frontend dependency was introduced.</w:t>
-      </w:r>
+      <w:r/>
     </w:p>
     <w:p>
       <w:pPr>
@@ -1828,11 +1798,9 @@
         <w:rPr>
           <w:rFonts w:ascii="DejaVu Sans" w:hAnsi="DejaVu Sans"/>
         </w:rPr>
-        <w:t xml:space="preserve">☐ </w:t>
+        <w:t>☑ Architectural decisions are documented where necessary.</w:t>
       </w:r>
-      <w:r>
-        <w:t>Architectural decisions are documented where necessary.</w:t>
-      </w:r>
+      <w:r/>
     </w:p>
     <w:p>
       <w:pPr>

</xml_diff>